<commit_message>
modify docs to exclude work completion.
</commit_message>
<xml_diff>
--- a/backend/templates/MamtaEnterprises_Docs.docx
+++ b/backend/templates/MamtaEnterprises_Docs.docx
@@ -755,332 +755,6 @@
           <w:rFonts w:ascii="Arial" w:hAnsi="Arial" w:cs="Arial"/>
         </w:rPr>
         <w:t>ignatory</w:t>
-      </w:r>
-    </w:p>
-    <w:p>
-      <w:pPr>
-        <w:jc w:val="center"/>
-        <w:rPr>
-          <w:rFonts w:ascii="Arial" w:hAnsi="Arial" w:cs="Arial"/>
-        </w:rPr>
-      </w:pPr>
-      <w:r>
-        <w:rPr>
-          <w:rFonts w:ascii="Arial" w:hAnsi="Arial" w:cs="Arial"/>
-        </w:rPr>
-        <w:br w:type="page"/>
-      </w:r>
-    </w:p>
-    <w:p>
-      <w:pPr>
-        <w:jc w:val="center"/>
-        <w:rPr>
-          <w:b/>
-          <w:bCs/>
-          <w:sz w:val="28"/>
-          <w:szCs w:val="28"/>
-          <w:u w:val="single"/>
-        </w:rPr>
-      </w:pPr>
-    </w:p>
-    <w:p>
-      <w:pPr>
-        <w:jc w:val="center"/>
-        <w:rPr>
-          <w:b/>
-          <w:bCs/>
-          <w:sz w:val="28"/>
-          <w:szCs w:val="28"/>
-          <w:u w:val="single"/>
-        </w:rPr>
-      </w:pPr>
-    </w:p>
-    <w:p>
-      <w:pPr>
-        <w:jc w:val="center"/>
-        <w:rPr>
-          <w:b/>
-          <w:bCs/>
-          <w:sz w:val="28"/>
-          <w:szCs w:val="28"/>
-          <w:u w:val="single"/>
-        </w:rPr>
-      </w:pPr>
-    </w:p>
-    <w:p>
-      <w:pPr>
-        <w:jc w:val="center"/>
-        <w:rPr>
-          <w:b/>
-          <w:bCs/>
-          <w:sz w:val="28"/>
-          <w:szCs w:val="28"/>
-          <w:u w:val="single"/>
-        </w:rPr>
-      </w:pPr>
-    </w:p>
-    <w:p>
-      <w:pPr>
-        <w:jc w:val="center"/>
-        <w:rPr>
-          <w:b/>
-          <w:bCs/>
-          <w:sz w:val="28"/>
-          <w:szCs w:val="28"/>
-          <w:u w:val="single"/>
-        </w:rPr>
-      </w:pPr>
-      <w:r>
-        <w:rPr>
-          <w:b/>
-          <w:bCs/>
-          <w:sz w:val="28"/>
-          <w:szCs w:val="28"/>
-          <w:u w:val="single"/>
-        </w:rPr>
-        <w:t>Work Completion Certificate</w:t>
-      </w:r>
-    </w:p>
-    <w:p>
-      <w:pPr>
-        <w:ind w:left="1440" w:right="1440"/>
-        <w:rPr>
-          <w:rFonts w:ascii="Arial" w:hAnsi="Arial" w:cs="Arial"/>
-        </w:rPr>
-      </w:pPr>
-      <w:r>
-        <w:rPr>
-          <w:rFonts w:ascii="Arial" w:hAnsi="Arial" w:cs="Arial"/>
-        </w:rPr>
-        <w:t>It is certified that the Solar Power Plant of capacity {</w:t>
-      </w:r>
-      <w:proofErr w:type="spellStart"/>
-      <w:r>
-        <w:rPr>
-          <w:rFonts w:ascii="Arial" w:hAnsi="Arial" w:cs="Arial"/>
-        </w:rPr>
-        <w:t>net_solar_capacity</w:t>
-      </w:r>
-      <w:proofErr w:type="spellEnd"/>
-      <w:r>
-        <w:rPr>
-          <w:rFonts w:ascii="Arial" w:hAnsi="Arial" w:cs="Arial"/>
-        </w:rPr>
-        <w:t>} KW</w:t>
-      </w:r>
-      <w:r>
-        <w:rPr>
-          <w:rFonts w:ascii="Arial" w:hAnsi="Arial" w:cs="Arial"/>
-        </w:rPr>
-        <w:t xml:space="preserve"> </w:t>
-      </w:r>
-      <w:r>
-        <w:rPr>
-          <w:rFonts w:ascii="Arial" w:hAnsi="Arial" w:cs="Arial"/>
-        </w:rPr>
-        <w:t xml:space="preserve">installed by </w:t>
-      </w:r>
-      <w:proofErr w:type="spellStart"/>
-      <w:r>
-        <w:rPr>
-          <w:rFonts w:ascii="Arial" w:hAnsi="Arial" w:cs="Arial"/>
-        </w:rPr>
-        <w:t>Mamta</w:t>
-      </w:r>
-      <w:proofErr w:type="spellEnd"/>
-      <w:r>
-        <w:rPr>
-          <w:rFonts w:ascii="Arial" w:hAnsi="Arial" w:cs="Arial"/>
-        </w:rPr>
-        <w:t xml:space="preserve"> Enterprises at {consumer_name}, {consumer_address}, Invoice No. {invoice_number}, Dated: {invoice_date}, in this system we have installed one inverter of capacity {inverter_capacity} KW and {no_of_panels} modules of {panel_capacity} watt</w:t>
-      </w:r>
-    </w:p>
-    <w:p>
-      <w:pPr>
-        <w:ind w:left="1440" w:right="1440"/>
-        <w:rPr>
-          <w:rFonts w:ascii="Arial" w:hAnsi="Arial" w:cs="Arial"/>
-        </w:rPr>
-      </w:pPr>
-      <w:r>
-        <w:rPr>
-          <w:rFonts w:ascii="Arial" w:hAnsi="Arial" w:cs="Arial"/>
-        </w:rPr>
-        <w:t xml:space="preserve">  Make of Inverter              :      {inverter_brand}</w:t>
-      </w:r>
-    </w:p>
-    <w:p>
-      <w:pPr>
-        <w:ind w:left="1440" w:right="1440"/>
-        <w:rPr>
-          <w:rFonts w:ascii="Arial" w:hAnsi="Arial" w:cs="Arial"/>
-        </w:rPr>
-      </w:pPr>
-      <w:r>
-        <w:rPr>
-          <w:rFonts w:ascii="Arial" w:hAnsi="Arial" w:cs="Arial"/>
-        </w:rPr>
-        <w:t xml:space="preserve">  Make of Module              :</w:t>
-      </w:r>
-      <w:r>
-        <w:tab/>
-      </w:r>
-      <w:r>
-        <w:rPr>
-          <w:rFonts w:ascii="Arial" w:hAnsi="Arial" w:cs="Arial"/>
-        </w:rPr>
-        <w:t xml:space="preserve">  {panel_brand}</w:t>
-      </w:r>
-    </w:p>
-    <w:p>
-      <w:pPr>
-        <w:ind w:left="1440" w:right="1440"/>
-        <w:rPr>
-          <w:rFonts w:ascii="Arial" w:hAnsi="Arial" w:cs="Arial"/>
-        </w:rPr>
-      </w:pPr>
-      <w:r>
-        <w:rPr>
-          <w:rFonts w:ascii="Arial" w:hAnsi="Arial" w:cs="Arial"/>
-        </w:rPr>
-        <w:t xml:space="preserve">  Number of Earthing         :      3</w:t>
-      </w:r>
-    </w:p>
-    <w:p>
-      <w:pPr>
-        <w:ind w:left="1440" w:right="1440"/>
-        <w:rPr>
-          <w:rFonts w:ascii="Arial" w:hAnsi="Arial" w:cs="Arial"/>
-        </w:rPr>
-      </w:pPr>
-      <w:r>
-        <w:rPr>
-          <w:rFonts w:ascii="Arial" w:hAnsi="Arial" w:cs="Arial"/>
-        </w:rPr>
-        <w:t xml:space="preserve">  Surge Protection </w:t>
-      </w:r>
-      <w:proofErr w:type="gramStart"/>
-      <w:r>
-        <w:rPr>
-          <w:rFonts w:ascii="Arial" w:hAnsi="Arial" w:cs="Arial"/>
-        </w:rPr>
-        <w:t>Device :</w:t>
-      </w:r>
-      <w:proofErr w:type="gramEnd"/>
-      <w:r>
-        <w:rPr>
-          <w:rFonts w:ascii="Arial" w:hAnsi="Arial" w:cs="Arial"/>
-        </w:rPr>
-        <w:t xml:space="preserve"> </w:t>
-      </w:r>
-      <w:r>
-        <w:rPr>
-          <w:rFonts w:ascii="Arial" w:hAnsi="Arial" w:cs="Arial"/>
-        </w:rPr>
-        <w:t>Yes</w:t>
-      </w:r>
-    </w:p>
-    <w:p>
-      <w:pPr>
-        <w:ind w:left="1440" w:right="1440"/>
-        <w:rPr>
-          <w:rFonts w:ascii="Arial" w:hAnsi="Arial" w:cs="Arial"/>
-        </w:rPr>
-      </w:pPr>
-      <w:r>
-        <w:rPr>
-          <w:rFonts w:ascii="Arial" w:hAnsi="Arial" w:cs="Arial"/>
-        </w:rPr>
-        <w:t xml:space="preserve">We, Mamta Enterprises, near Bank of India, Jind Road, Kaithal, HR, certify that this system is installed as per MNRE guidelines and is safe (all the safety measures are being taken care </w:t>
-      </w:r>
-      <w:proofErr w:type="gramStart"/>
-      <w:r>
-        <w:rPr>
-          <w:rFonts w:ascii="Arial" w:hAnsi="Arial" w:cs="Arial"/>
-        </w:rPr>
-        <w:t>of )</w:t>
-      </w:r>
-      <w:proofErr w:type="gramEnd"/>
-      <w:r>
-        <w:rPr>
-          <w:rFonts w:ascii="Arial" w:hAnsi="Arial" w:cs="Arial"/>
-        </w:rPr>
-        <w:t>.</w:t>
-      </w:r>
-    </w:p>
-    <w:p>
-      <w:pPr>
-        <w:tabs>
-          <w:tab w:val="left" w:pos="4140"/>
-        </w:tabs>
-        <w:ind w:left="1440" w:right="1440"/>
-        <w:rPr>
-          <w:rFonts w:ascii="Arial" w:hAnsi="Arial" w:cs="Arial"/>
-        </w:rPr>
-      </w:pPr>
-      <w:r>
-        <w:rPr>
-          <w:rFonts w:ascii="Arial" w:hAnsi="Arial" w:cs="Arial"/>
-        </w:rPr>
-        <w:t>Thanking you.</w:t>
-      </w:r>
-    </w:p>
-    <w:p>
-      <w:pPr>
-        <w:ind w:left="1440" w:right="1440"/>
-        <w:rPr>
-          <w:rFonts w:ascii="Arial" w:hAnsi="Arial" w:cs="Arial"/>
-        </w:rPr>
-      </w:pPr>
-    </w:p>
-    <w:p>
-      <w:pPr>
-        <w:ind w:left="1440" w:right="1440"/>
-        <w:rPr>
-          <w:rFonts w:ascii="Arial" w:hAnsi="Arial" w:cs="Arial"/>
-        </w:rPr>
-      </w:pPr>
-      <w:r>
-        <w:rPr>
-          <w:rFonts w:ascii="Arial" w:hAnsi="Arial" w:cs="Arial"/>
-        </w:rPr>
-        <w:t>Yours truly,</w:t>
-      </w:r>
-    </w:p>
-    <w:p>
-      <w:pPr>
-        <w:ind w:left="1440" w:right="1440"/>
-        <w:rPr>
-          <w:rFonts w:ascii="Arial" w:hAnsi="Arial" w:cs="Arial"/>
-        </w:rPr>
-      </w:pPr>
-      <w:r>
-        <w:rPr>
-          <w:rFonts w:ascii="Arial" w:hAnsi="Arial" w:cs="Arial"/>
-        </w:rPr>
-        <w:t>For Mamta Enterprises</w:t>
-      </w:r>
-    </w:p>
-    <w:p>
-      <w:pPr>
-        <w:ind w:left="1440" w:right="1440"/>
-        <w:rPr>
-          <w:rFonts w:ascii="Arial" w:hAnsi="Arial" w:cs="Arial"/>
-        </w:rPr>
-      </w:pPr>
-    </w:p>
-    <w:p>
-      <w:pPr>
-        <w:ind w:left="1440" w:right="1440"/>
-        <w:rPr>
-          <w:rFonts w:ascii="Arial" w:hAnsi="Arial" w:cs="Arial"/>
-        </w:rPr>
-      </w:pPr>
-      <w:r>
-        <w:rPr>
-          <w:rFonts w:ascii="Arial" w:hAnsi="Arial" w:cs="Arial"/>
-        </w:rPr>
-        <w:t>Auth.Signatory</w:t>
       </w:r>
     </w:p>
     <w:p>

</xml_diff>